<commit_message>
Use full 16-model CMIP6 ensemble for Nairobi, Dar es Salaam and Lagos
Rerun futures and the five-city urbanisation-vs-climate comparison; update
paper 1 warming, uplift and ratio tables.

Co-Authored-By: Claude Opus 5.5 <noreply@anthropic.com>
</commit_message>
<xml_diff>
--- a/paper/urban_flooding_five_cities.docx
+++ b/paper/urban_flooding_five_cities.docx
@@ -1402,7 +1402,7 @@
               <w:pStyle w:val="Compact"/>
             </w:pPr>
             <w:r>
-              <w:t xml:space="preserve">16 models (East Africa grid, Kampala; Johannesburg point); 7–10 models at the other cities</w:t>
+              <w:t xml:space="preserve">16 models at every city (East Africa grid for Kampala; city point for the others)</w:t>
             </w:r>
           </w:p>
         </w:tc>
@@ -1799,7 +1799,7 @@
               <w:pStyle w:val="Compact"/>
             </w:pPr>
             <w:r>
-              <w:t xml:space="preserve">1.35</w:t>
+              <w:t xml:space="preserve">1.27</w:t>
             </w:r>
           </w:p>
         </w:tc>
@@ -1821,7 +1821,7 @@
               <w:pStyle w:val="Compact"/>
             </w:pPr>
             <w:r>
-              <w:t xml:space="preserve">1.24</w:t>
+              <w:t xml:space="preserve">1.23</w:t>
             </w:r>
           </w:p>
         </w:tc>
@@ -1867,7 +1867,7 @@
               <w:pStyle w:val="Compact"/>
             </w:pPr>
             <w:r>
-              <w:t xml:space="preserve">1.92</w:t>
+              <w:t xml:space="preserve">1.85</w:t>
             </w:r>
           </w:p>
         </w:tc>
@@ -1889,7 +1889,7 @@
               <w:pStyle w:val="Compact"/>
             </w:pPr>
             <w:r>
-              <w:t xml:space="preserve">1.68</w:t>
+              <w:t xml:space="preserve">1.62</w:t>
             </w:r>
           </w:p>
         </w:tc>
@@ -1935,7 +1935,7 @@
               <w:pStyle w:val="Compact"/>
             </w:pPr>
             <w:r>
-              <w:t xml:space="preserve">+10%</w:t>
+              <w:t xml:space="preserve">+9%</w:t>
             </w:r>
           </w:p>
         </w:tc>
@@ -2003,7 +2003,7 @@
               <w:pStyle w:val="Compact"/>
             </w:pPr>
             <w:r>
-              <w:t xml:space="preserve">+14%</w:t>
+              <w:t xml:space="preserve">+13%</w:t>
             </w:r>
           </w:p>
         </w:tc>
@@ -3612,18 +3612,18 @@
               <w:pStyle w:val="Compact"/>
             </w:pPr>
             <w:r>
-              <w:t xml:space="preserve">+15%</w:t>
-            </w:r>
-          </w:p>
-        </w:tc>
-        <w:tc>
-          <w:tcPr/>
-          <w:p>
-            <w:pPr>
-              <w:pStyle w:val="Compact"/>
-            </w:pPr>
-            <w:r>
-              <w:t xml:space="preserve">3.3 / 2.4</w:t>
+              <w:t xml:space="preserve">+14%</w:t>
+            </w:r>
+          </w:p>
+        </w:tc>
+        <w:tc>
+          <w:tcPr/>
+          <w:p>
+            <w:pPr>
+              <w:pStyle w:val="Compact"/>
+            </w:pPr>
+            <w:r>
+              <w:t xml:space="preserve">3.4 / 2.5</w:t>
             </w:r>
           </w:p>
         </w:tc>
@@ -3715,29 +3715,29 @@
               <w:pStyle w:val="Compact"/>
             </w:pPr>
             <w:r>
-              <w:t xml:space="preserve">+12%</w:t>
-            </w:r>
-          </w:p>
-        </w:tc>
-        <w:tc>
-          <w:tcPr/>
-          <w:p>
-            <w:pPr>
-              <w:pStyle w:val="Compact"/>
-            </w:pPr>
-            <w:r>
-              <w:t xml:space="preserve">+18%</w:t>
-            </w:r>
-          </w:p>
-        </w:tc>
-        <w:tc>
-          <w:tcPr/>
-          <w:p>
-            <w:pPr>
-              <w:pStyle w:val="Compact"/>
-            </w:pPr>
-            <w:r>
-              <w:t xml:space="preserve">2.5 / 1.7</w:t>
+              <w:t xml:space="preserve">+11%</w:t>
+            </w:r>
+          </w:p>
+        </w:tc>
+        <w:tc>
+          <w:tcPr/>
+          <w:p>
+            <w:pPr>
+              <w:pStyle w:val="Compact"/>
+            </w:pPr>
+            <w:r>
+              <w:t xml:space="preserve">+17%</w:t>
+            </w:r>
+          </w:p>
+        </w:tc>
+        <w:tc>
+          <w:tcPr/>
+          <w:p>
+            <w:pPr>
+              <w:pStyle w:val="Compact"/>
+            </w:pPr>
+            <w:r>
+              <w:t xml:space="preserve">2.7 / 1.8</w:t>
             </w:r>
           </w:p>
         </w:tc>
@@ -4184,7 +4184,7 @@
         <w:t xml:space="preserve"> </w:t>
       </w:r>
       <w:r>
-        <w:t xml:space="preserve">Clausius–Clapeyron scaling may understate short-duration intensification. The new cities rely on 7–10 CMIP6 models.</w:t>
+        <w:t xml:space="preserve">Clausius–Clapeyron scaling may understate short-duration intensification.</w:t>
       </w:r>
     </w:p>
     <w:bookmarkEnd w:id="48"/>
@@ -4258,7 +4258,7 @@
         <w:t xml:space="preserve">Design for end-of-life imperviousness</w:t>
       </w:r>
       <w:r>
-        <w:t xml:space="preserve">, then add a climate allowance: +8–14% by 2041–2070 in the four tropical cities and +13–19% in Johannesburg.</w:t>
+        <w:t xml:space="preserve">, then add a climate allowance: +8–13% by 2041–2070 in the four tropical cities and +13–19% in Johannesburg.</w:t>
       </w:r>
     </w:p>
     <w:p>

</xml_diff>